<commit_message>
feat: add independent local-project verifier and public evidence gate
- Local Project sessions now verify candidates through an independent
  LocalProjectVerifier (clean-worktree baseline, repro/regression checks,
  written verification certificate) instead of a single in-place command
- controller stop with an active candidate now defers to the verifier
  instead of failing closed, so near-miss runs are judged on evidence
- add scripts/verify_public_evidence.py fail-closed evidence gate and a
  CI job running it; scrub local machine paths from the R6 capsule
- add case-brief projection for headless session reports
- tests: 181 focused tests covering the new verifier, gate, and UI flows
</commit_message>
<xml_diff>
--- a/docs/agentic-debugging-technical-project-report-2026-08-28.docx
+++ b/docs/agentic-debugging-technical-project-report-2026-08-28.docx
@@ -100,21 +100,7 @@
         <w:spacing w:after="40"/>
       </w:pPr>
       <w:r>
-        <w:rPr>
-          <w:rFonts w:ascii="Calibri" w:hAnsi="Calibri" w:eastAsia="Calibri"/>
-          <w:b/>
-          <w:color w:val="000000"/>
-          <w:sz w:val="21"/>
-        </w:rPr>
-        <w:t xml:space="preserve">Sürüm: </w:t>
-      </w:r>
-      <w:r>
-        <w:rPr>
-          <w:rFonts w:ascii="Calibri" w:hAnsi="Calibri" w:eastAsia="Calibri"/>
-          <w:color w:val="000000"/>
-          <w:sz w:val="21"/>
-        </w:rPr>
-        <w:t>v0.1.0 — post-tag kapanış adayı</w:t>
+        <w:t>Sürüm: v0.1.0 sonrası kamu inceleme adayı</w:t>
       </w:r>
     </w:p>
     <w:p>
@@ -122,21 +108,7 @@
         <w:spacing w:after="40"/>
       </w:pPr>
       <w:r>
-        <w:rPr>
-          <w:rFonts w:ascii="Calibri" w:hAnsi="Calibri" w:eastAsia="Calibri"/>
-          <w:b/>
-          <w:color w:val="000000"/>
-          <w:sz w:val="21"/>
-        </w:rPr>
-        <w:t xml:space="preserve">Durum: </w:t>
-      </w:r>
-      <w:r>
-        <w:rPr>
-          <w:rFonts w:ascii="Calibri" w:hAnsi="Calibri" w:eastAsia="Calibri"/>
-          <w:color w:val="000000"/>
-          <w:sz w:val="21"/>
-        </w:rPr>
-        <w:t>Zorunlu proje döngüsü kapalı; yeni iş owner onayı gerektirir</w:t>
+        <w:t>Durum: Zorunlu proje döngüsü kapalı; kamuya açılma öncesi kanıt bütünlüğü hardening’i FirstMate incelemesinde</w:t>
       </w:r>
     </w:p>
     <w:p>
@@ -163,7 +135,7 @@
     </w:p>
     <w:p>
       <w:r>
-        <w:t>Zorunlu döngü 28 Ağustos 2026’da kapanmıştır. v0.1.0 etiketi d01f7a5’i gösterir. Post-tag uygulama onarımı 8b2479b’dedir. Arşiv ve rapor adayı Git güvenlik kapısı nedeniyle unstaged’dır. Merge ve push yoktur.</w:t>
+        <w:t>Zorunlu döngü 28 Ağustos 2026’da kapanmıştır. v0.1.0 etiketi d01f7a5’i gösterir. Post-tag uygulama onarımı 8b2479b’dedir. Kamuya açılma öncesi hardening değişiklikleri FirstMate incelemesi için çalışma ağacında tutulmaktadır. Merge ve push yapılmamıştır.</w:t>
       </w:r>
     </w:p>
     <w:p>
@@ -1953,7 +1925,7 @@
         <w:keepNext/>
       </w:pPr>
       <w:r>
-        <w:t>Textual tabanlı yerel uygulama, bilimsel çekirdeğin ayrı bir kopyası değildir. Aynı session, controller, runtime, verifier ve event sözleşmelerini kullanır. Ürün katmanı task seçimi, model kaynağı, canlı durum, cancellation, history, replay ve Apply To Project akışını sağlar.</w:t>
+        <w:t>Textual tabanlı yerel uygulama, bilimsel çekirdeğin ayrı bir kopyası değildir. Aynı session, controller, runtime, independent verifier ve event sözleşmelerini kullanır. Ürün katmanı task seçimi, model kaynağı, canlı durum, cancellation, history, replay, Evidence Review ve Apply To Project akışlarını sunar.</w:t>
       </w:r>
     </w:p>
     <w:tbl>
@@ -2436,17 +2408,8 @@
             </w:tcMar>
           </w:tcPr>
           <w:p>
-            <w:pPr>
-              <w:keepNext/>
-              <w:spacing w:before="0" w:after="40" w:line="240" w:lineRule="auto"/>
-            </w:pPr>
             <w:r>
-              <w:rPr>
-                <w:rFonts w:ascii="Calibri" w:hAnsi="Calibri" w:eastAsia="Calibri"/>
-                <w:color w:val="000000"/>
-                <w:sz w:val="18"/>
-              </w:rPr>
-              <w:t>Kullanıcı repo’sunda izole worktree</w:t>
+              <w:t>Kullanıcı repo’sunda arşivlenmiş dört bağımsız disposable workspace</w:t>
             </w:r>
           </w:p>
         </w:tc>
@@ -2462,17 +2425,8 @@
             </w:tcMar>
           </w:tcPr>
           <w:p>
-            <w:pPr>
-              <w:keepNext/>
-              <w:spacing w:before="0" w:after="40" w:line="240" w:lineRule="auto"/>
-            </w:pPr>
             <w:r>
-              <w:rPr>
-                <w:rFonts w:ascii="Calibri" w:hAnsi="Calibri" w:eastAsia="Calibri"/>
-                <w:color w:val="000000"/>
-                <w:sz w:val="18"/>
-              </w:rPr>
-              <w:t>CommandRunner, job object, ledger ve apply gates</w:t>
+              <w:t>Baseline failure/regression, ayrı F2P/P2P patch uygulaması, sertifika ve apply-time Git kapıları</w:t>
             </w:r>
           </w:p>
         </w:tc>
@@ -2564,6 +2518,40 @@
       </w:pPr>
       <w:r>
         <w:t>Kaynak: docs/architecture/local-application-v1.md; agentic_debugger/application/; agentic_debugger/ui/.</w:t>
+      </w:r>
+    </w:p>
+    <w:p>
+      <w:pPr>
+        <w:pStyle w:val="Heading2"/>
+      </w:pPr>
+      <w:r>
+        <w:t>Local Project doğrulama ve uygulama zinciri</w:t>
+      </w:r>
+    </w:p>
+    <w:p>
+      <w:pPr/>
+      <w:r>
+        <w:t>Local Project verifier, controller sonucuna güvenmez. Orijinal failure, baseline regression, patched F2P ve patched P2P komutlarını dört ayrı temiz export üzerinde çalıştırır. Patch, F2P ve P2P kopyalarına bağımsız uygulanır; süreçler ortak dosya sistemi durumu paylaşmaz.</w:t>
+      </w:r>
+    </w:p>
+    <w:p>
+      <w:pPr/>
+      <w:r>
+        <w:t>Verification certificate; task kimliği, session kimliği, canonical task-spec SHA-256, source HEAD, patch SHA-256, outcome ve cleanup kanıtını bağlar. Apply To Project aynı bağları ve temiz Git durumunu git apply işleminden hemen önce yeniden denetler. Harici eşzamanlı Git yazıcılarını kilitleyen bir repository lock bulunmadığı açık bir trusted-local sınırlamadır.</w:t>
+      </w:r>
+    </w:p>
+    <w:p>
+      <w:pPr/>
+      <w:r>
+        <w:t>Evidence Review, Reproduce → Inspect → Diagnose → Change → Verify → Cleanup zincirini aynı session projection’ından üretir. Controller tanısı bir claim’dir. Yalnız bağımsız verifier sonucu doğruluk otoritesidir. Replay yeni doğruluk üretmez; kaydedilmiş prefix’i gösterir.</w:t>
+      </w:r>
+    </w:p>
+    <w:p>
+      <w:pPr>
+        <w:pStyle w:val="TableCitation"/>
+      </w:pPr>
+      <w:r>
+        <w:t>Kaynak: agentic_debugger/evaluation/local_project_verifier.py; agentic_debugger/application/case_brief.py; agentic_debugger/application/local_project.py.</w:t>
       </w:r>
     </w:p>
     <w:p>
@@ -4401,16 +4389,8 @@
             </w:tcMar>
           </w:tcPr>
           <w:p>
-            <w:pPr>
-              <w:spacing w:before="0" w:after="40" w:line="240" w:lineRule="auto"/>
-            </w:pPr>
             <w:r>
-              <w:rPr>
-                <w:rFonts w:ascii="Calibri" w:hAnsi="Calibri" w:eastAsia="Calibri"/>
-                <w:color w:val="000000"/>
-                <w:sz w:val="18"/>
-              </w:rPr>
-              <w:t>6002</w:t>
+              <w:t>6031</w:t>
             </w:r>
           </w:p>
         </w:tc>
@@ -4996,6 +4976,102 @@
                 <w:sz w:val="18"/>
               </w:rPr>
               <w:t>F2P 1/1; P2P 2/2; PDB arm 5/5 observations</w:t>
+            </w:r>
+          </w:p>
+        </w:tc>
+      </w:tr>
+      <w:tr>
+        <w:tc>
+          <w:tcPr>
+            <w:tcW w:type="dxa" w:w="2400"/>
+          </w:tcPr>
+          <w:p>
+            <w:r>
+              <w:t>Public hardening focused tests</w:t>
+            </w:r>
+          </w:p>
+        </w:tc>
+        <w:tc>
+          <w:tcPr>
+            <w:tcW w:type="dxa" w:w="2400"/>
+          </w:tcPr>
+          <w:p>
+            <w:r>
+              <w:t>189/189 pass</w:t>
+            </w:r>
+          </w:p>
+        </w:tc>
+        <w:tc>
+          <w:tcPr>
+            <w:tcW w:type="dxa" w:w="4560"/>
+          </w:tcPr>
+          <w:p>
+            <w:r>
+              <w:t>Local verifier, Apply proof, Evidence Review, UI ve R6 public-contract yüzeyleri</w:t>
+            </w:r>
+          </w:p>
+        </w:tc>
+      </w:tr>
+      <w:tr>
+        <w:tc>
+          <w:tcPr>
+            <w:tcW w:type="dxa" w:w="2400"/>
+          </w:tcPr>
+          <w:p>
+            <w:r>
+              <w:t>Public evidence diagnostic</w:t>
+            </w:r>
+          </w:p>
+        </w:tc>
+        <w:tc>
+          <w:tcPr>
+            <w:tcW w:type="dxa" w:w="2400"/>
+          </w:tcPr>
+          <w:p>
+            <w:r>
+              <w:t>VERIFIED_DIRTY</w:t>
+            </w:r>
+          </w:p>
+        </w:tc>
+        <w:tc>
+          <w:tcPr>
+            <w:tcW w:type="dxa" w:w="4560"/>
+          </w:tcPr>
+          <w:p>
+            <w:r>
+              <w:t>10/10 capsule; 15/15 byte-identical trace; leakage 0; 2/2 offline RESOLVED; release_eligible=false</w:t>
+            </w:r>
+          </w:p>
+        </w:tc>
+      </w:tr>
+      <w:tr>
+        <w:tc>
+          <w:tcPr>
+            <w:tcW w:type="dxa" w:w="2400"/>
+          </w:tcPr>
+          <w:p>
+            <w:r>
+              <w:t>Terminal görsel QA</w:t>
+            </w:r>
+          </w:p>
+        </w:tc>
+        <w:tc>
+          <w:tcPr>
+            <w:tcW w:type="dxa" w:w="2400"/>
+          </w:tcPr>
+          <w:p>
+            <w:r>
+              <w:t>4/4 viewport</w:t>
+            </w:r>
+          </w:p>
+        </w:tc>
+        <w:tc>
+          <w:tcPr>
+            <w:tcW w:type="dxa" w:w="4560"/>
+          </w:tcPr>
+          <w:p>
+            <w:r>
+              <w:t>Start ve Evidence Review; 80×24 ve 120×40</w:t>
             </w:r>
           </w:p>
         </w:tc>
@@ -6253,6 +6329,48 @@
     <w:p>
       <w:pPr>
         <w:pStyle w:val="Heading1"/>
+      </w:pPr>
+      <w:r>
+        <w:t>Kamuya açık kanıt kapısı</w:t>
+      </w:r>
+    </w:p>
+    <w:p>
+      <w:pPr/>
+      <w:r>
+        <w:t>Kamuya açık sürüm kapısı tek komutla çalışır. Varsayılan mod temiz ve geçerli bir Git HEAD ister; başlangıç ile bitiş arasında HEAD ve working-tree durumunun değişmediğini denetler.</w:t>
+      </w:r>
+    </w:p>
+    <w:p>
+      <w:pPr>
+        <w:pStyle w:val="Code"/>
+      </w:pPr>
+      <w:r>
+        <w:t>python scripts/verify_public_evidence.py</w:t>
+      </w:r>
+    </w:p>
+    <w:p>
+      <w:pPr/>
+      <w:r>
+        <w:t>Kapı R6 frozen capsule hash zincirini doğrular, 15 professor trace dosyasını byte-identical yeniden üretir, leakage taraması yapar, professor-facing export ve capsule manifest taşınabilirliğini denetler. Ayrıca iki policy arm için independent verifier, replay, cleanup ve canonical immutability içeren temsili offline demo çalıştırır. Gözlenen provider ve network attempt sayısı sıfır olmalıdır.</w:t>
+      </w:r>
+    </w:p>
+    <w:p>
+      <w:pPr/>
+      <w:r>
+        <w:t>--allow-dirty yalnız geliştirme teşhisidir. Bu mod VERIFIED_DIRTY üretir ve release_eligible=false bırakır. Frozen kampanyaları yeniden çalıştırdığını, scripted reference repair’ın canlı model kabiliyeti olduğunu veya in-process network guard’ın işletim sistemi sandbox’ı olduğunu iddia etmez. Ham ancillary evidence makine yolları taşıyabilir; portability garantisi capsule manifest ve professor-facing export yüzeyiyle sınırlıdır.</w:t>
+      </w:r>
+    </w:p>
+    <w:p>
+      <w:pPr>
+        <w:pStyle w:val="TableCitation"/>
+      </w:pPr>
+      <w:r>
+        <w:t>Kaynak: scripts/verify_public_evidence.py; .github/workflows/ci.yml; experiments/r6_debugger_training/runs/frozen/capsule_manifest.json.</w:t>
+      </w:r>
+    </w:p>
+    <w:p>
+      <w:pPr>
+        <w:pStyle w:val="Heading1"/>
         <w:keepNext/>
       </w:pPr>
       <w:r>
@@ -6383,6 +6501,22 @@
     </w:p>
     <w:p>
       <w:pPr>
+        <w:pStyle w:val="ListBullet"/>
+      </w:pPr>
+      <w:r>
+        <w:t>agentic_debugger/evaluation/local_project_verifier.py — Local Project için bağımsız, fail-closed doğrulama.</w:t>
+      </w:r>
+    </w:p>
+    <w:p>
+      <w:pPr>
+        <w:pStyle w:val="ListBullet"/>
+      </w:pPr>
+      <w:r>
+        <w:t>scripts/verify_public_evidence.py — temiz-repo kamu kanıt kapısı ve dürüst sınırlama kaydı.</w:t>
+      </w:r>
+    </w:p>
+    <w:p>
+      <w:pPr>
         <w:numPr>
           <w:ilvl w:val="0"/>
           <w:numId w:val="10"/>
@@ -6405,7 +6539,7 @@
     </w:p>
     <w:p>
       <w:r>
-        <w:t>Proje, debugger-assisted repair için araştırılabilir ve denetlenebilir bir sistem kurmuştur. En güçlü yönü tek bir model sonucu değildir. Güçlü yön; runtime evidence, patch lifecycle, bağımsız verification, replay ve cleanup’ın aynı fail-closed sözleşmede birleşmesidir.</w:t>
+        <w:t>Proje, debugger-assisted repair için araştırılabilir ve denetlenebilir bir sistem kurmuştur. En güçlü yönü tek bir model sonucu değildir. Güçlü yön; runtime evidence, patch lifecycle, bağımsız verification, replay, cleanup ve kamuya açık kanıt kapısının aynı fail-closed sözleşmede birleşmesidir.</w:t>
       </w:r>
     </w:p>
     <w:p>

</xml_diff>